<commit_message>
implementation documents to document implementation statuses and project status updates.  Added new docs to support prompt injection testing
</commit_message>
<xml_diff>
--- a/planing/implementation-plan/Policy_Assistant_I-31_Direct_Implementation_Instructions.docx
+++ b/planing/implementation-plan/Policy_Assistant_I-31_Direct_Implementation_Instructions.docx
@@ -223,21 +223,7 @@
         <w:rPr>
           <w:b/>
         </w:rPr>
-        <w:t xml:space="preserve">Create the first </w:t>
-      </w:r>
-      <w:proofErr w:type="gramStart"/>
-      <w:r>
-        <w:rPr>
-          <w:b/>
-        </w:rPr>
-        <w:t>versioned</w:t>
-      </w:r>
-      <w:proofErr w:type="gramEnd"/>
-      <w:r>
-        <w:rPr>
-          <w:b/>
-        </w:rPr>
-        <w:t xml:space="preserve"> system prompt file</w:t>
+        <w:t>Create the first versioned system prompt file</w:t>
       </w:r>
       <w:r>
         <w:t xml:space="preserve">. </w:t>
@@ -743,17 +729,8 @@
           <w:b/>
           <w:bCs/>
         </w:rPr>
-        <w:t xml:space="preserve"> base system </w:t>
-      </w:r>
-      <w:proofErr w:type="gramStart"/>
-      <w:r>
-        <w:rPr>
-          <w:b/>
-          <w:bCs/>
-        </w:rPr>
-        <w:t>prompt</w:t>
-      </w:r>
-      <w:proofErr w:type="gramEnd"/>
+        <w:t xml:space="preserve"> base system prompt</w:t>
+      </w:r>
       <w:r>
         <w:t>.</w:t>
       </w:r>
@@ -1871,16 +1848,8 @@
         <w:rPr>
           <w:u w:val="thick"/>
         </w:rPr>
-        <w:t xml:space="preserve">I-09/I-32 </w:t>
-      </w:r>
-      <w:proofErr w:type="gramStart"/>
-      <w:r>
-        <w:rPr>
-          <w:u w:val="thick"/>
-        </w:rPr>
-        <w:t>remain</w:t>
-      </w:r>
-      <w:proofErr w:type="gramEnd"/>
+        <w:t>I-09/I-32 remain</w:t>
+      </w:r>
       <w:r>
         <w:t xml:space="preserve"> </w:t>
       </w:r>
@@ -2413,32 +2382,125 @@
       <w:r>
         <w:rPr>
           <w:b/>
+          <w:color w:val="00B050"/>
+          <w:u w:val="thick"/>
+        </w:rPr>
+        <w:t>COMPLET</w:t>
+      </w:r>
+      <w:r>
+        <w:rPr>
+          <w:b/>
           <w:color w:val="8064A2" w:themeColor="accent4"/>
+        </w:rPr>
+        <w:t xml:space="preserve"> </w:t>
+      </w:r>
+      <w:r>
+        <w:rPr>
+          <w:b/>
+        </w:rPr>
+        <w:t xml:space="preserve">- </w:t>
+      </w:r>
+      <w:r>
+        <w:rPr>
+          <w:b/>
+        </w:rPr>
+        <w:t>Add prompt-injection resistance instructions</w:t>
+      </w:r>
+      <w:r>
+        <w:t xml:space="preserve">. </w:t>
+      </w:r>
+      <w:r>
+        <w:rPr>
           <w:u w:val="thick"/>
         </w:rPr>
-        <w:t>IN PROCESS</w:t>
-      </w:r>
-      <w:r>
-        <w:rPr>
-          <w:b/>
-          <w:color w:val="8064A2" w:themeColor="accent4"/>
-        </w:rPr>
+        <w:t>Treat</w:t>
+      </w:r>
+      <w:r>
         <w:t xml:space="preserve"> </w:t>
       </w:r>
       <w:r>
         <w:rPr>
           <w:b/>
+          <w:bCs/>
+        </w:rPr>
+        <w:t>retrieved policy documents</w:t>
+      </w:r>
+      <w:r>
+        <w:t xml:space="preserve">, </w:t>
+      </w:r>
+      <w:r>
+        <w:rPr>
+          <w:b/>
+          <w:bCs/>
+        </w:rPr>
+        <w:t>conversation text</w:t>
+      </w:r>
+      <w:r>
+        <w:t xml:space="preserve">, </w:t>
+      </w:r>
+      <w:r>
+        <w:rPr>
+          <w:b/>
+          <w:bCs/>
+        </w:rPr>
+        <w:t>summaries</w:t>
+      </w:r>
+      <w:r>
+        <w:t xml:space="preserve">, and </w:t>
+      </w:r>
+      <w:r>
+        <w:rPr>
+          <w:b/>
+          <w:bCs/>
+        </w:rPr>
+        <w:t>memory</w:t>
+      </w:r>
+      <w:r>
+        <w:t xml:space="preserve"> as </w:t>
+      </w:r>
+      <w:r>
+        <w:rPr>
+          <w:b/>
+          <w:bCs/>
+        </w:rPr>
+        <w:t>data/context</w:t>
+      </w:r>
+      <w:r>
+        <w:t xml:space="preserve">. They </w:t>
+      </w:r>
+      <w:r>
+        <w:rPr>
+          <w:b/>
+          <w:bCs/>
+        </w:rPr>
+        <w:t xml:space="preserve">must not </w:t>
+      </w:r>
+      <w:r>
+        <w:rPr>
+          <w:b/>
+          <w:bCs/>
         </w:rPr>
         <w:t xml:space="preserve">- </w:t>
       </w:r>
       <w:r>
         <w:rPr>
           <w:b/>
-        </w:rPr>
-        <w:t>Add prompt-injection resistance instructions</w:t>
-      </w:r>
-      <w:r>
-        <w:t>. Treat retrieved policy documents, conversation text, summaries, and memory as data/context. They must not override system-level instructions.</w:t>
+          <w:bCs/>
+        </w:rPr>
+        <w:t>override system-level</w:t>
+      </w:r>
+      <w:r>
+        <w:t xml:space="preserve"> </w:t>
+      </w:r>
+      <w:r>
+        <w:rPr>
+          <w:b/>
+          <w:bCs/>
+        </w:rPr>
+        <w:t>instructions</w:t>
+      </w:r>
+      <w:r>
+        <w:t>.</w:t>
       </w:r>
     </w:p>
     <w:p>
@@ -2448,11 +2510,119 @@
       <w:r>
         <w:rPr>
           <w:b/>
-        </w:rPr>
-        <w:t>Update the I-26 context assembler to use the centralized prompt loader</w:t>
-      </w:r>
-      <w:r>
-        <w:t>. Replace hard-coded system prompt fragments with a call such as system_prompt = load_system_prompt().</w:t>
+          <w:color w:val="00B050"/>
+          <w:u w:val="thick"/>
+        </w:rPr>
+        <w:t>COMPLET</w:t>
+      </w:r>
+      <w:r>
+        <w:rPr>
+          <w:b/>
+          <w:color w:val="8064A2" w:themeColor="accent4"/>
+        </w:rPr>
+        <w:t xml:space="preserve"> </w:t>
+      </w:r>
+      <w:r>
+        <w:rPr>
+          <w:b/>
+        </w:rPr>
+        <w:t xml:space="preserve">- </w:t>
+      </w:r>
+      <w:r>
+        <w:rPr>
+          <w:b/>
+        </w:rPr>
+        <w:t xml:space="preserve">Update </w:t>
+      </w:r>
+      <w:r>
+        <w:rPr>
+          <w:bCs/>
+        </w:rPr>
+        <w:t>the</w:t>
+      </w:r>
+      <w:r>
+        <w:rPr>
+          <w:b/>
+        </w:rPr>
+        <w:t xml:space="preserve"> I-26 context assembler </w:t>
+      </w:r>
+      <w:r>
+        <w:rPr>
+          <w:bCs/>
+        </w:rPr>
+        <w:t xml:space="preserve">to </w:t>
+      </w:r>
+      <w:r>
+        <w:rPr>
+          <w:b/>
+        </w:rPr>
+        <w:t>use</w:t>
+      </w:r>
+      <w:r>
+        <w:rPr>
+          <w:b/>
+        </w:rPr>
+        <w:t xml:space="preserve"> </w:t>
+      </w:r>
+      <w:r>
+        <w:rPr>
+          <w:bCs/>
+        </w:rPr>
+        <w:t>the</w:t>
+      </w:r>
+      <w:r>
+        <w:rPr>
+          <w:b/>
+        </w:rPr>
+        <w:t xml:space="preserve"> centralized prompt loader</w:t>
+      </w:r>
+      <w:r>
+        <w:t xml:space="preserve">. </w:t>
+      </w:r>
+      <w:r>
+        <w:rPr>
+          <w:u w:val="thick"/>
+        </w:rPr>
+        <w:t>Replace</w:t>
+      </w:r>
+      <w:r>
+        <w:t xml:space="preserve"> </w:t>
+      </w:r>
+      <w:r>
+        <w:rPr>
+          <w:b/>
+          <w:bCs/>
+        </w:rPr>
+        <w:t>hard-coded system prompt fragments</w:t>
+      </w:r>
+      <w:r>
+        <w:t xml:space="preserve"> </w:t>
+      </w:r>
+      <w:r>
+        <w:rPr>
+          <w:u w:val="thick"/>
+        </w:rPr>
+        <w:t>with</w:t>
+      </w:r>
+      <w:r>
+        <w:t xml:space="preserve"> a </w:t>
+      </w:r>
+      <w:r>
+        <w:rPr>
+          <w:b/>
+          <w:bCs/>
+        </w:rPr>
+        <w:t>call</w:t>
+      </w:r>
+      <w:r>
+        <w:t xml:space="preserve"> such as </w:t>
+      </w:r>
+      <w:r>
+        <w:rPr>
+          <w:b/>
+          <w:bCs/>
+        </w:rPr>
+        <w:t>system_prompt = load_system_prompt().</w:t>
       </w:r>
     </w:p>
     <w:p>
@@ -2462,11 +2632,155 @@
       <w:r>
         <w:rPr>
           <w:b/>
+          <w:color w:val="00B050"/>
+          <w:u w:val="thick"/>
+        </w:rPr>
+        <w:t>COMPLET</w:t>
+      </w:r>
+      <w:r>
+        <w:rPr>
+          <w:b/>
+          <w:color w:val="8064A2" w:themeColor="accent4"/>
+        </w:rPr>
+        <w:t xml:space="preserve"> </w:t>
+      </w:r>
+      <w:r>
+        <w:rPr>
+          <w:b/>
+        </w:rPr>
+        <w:t xml:space="preserve">- </w:t>
+      </w:r>
+      <w:r>
+        <w:rPr>
+          <w:b/>
         </w:rPr>
         <w:t>Ensure only one authoritative base-system-prompt path exists</w:t>
       </w:r>
       <w:r>
-        <w:t>. After validating the loader, consolidate or remove duplicate system-level instruction strings so prompt behavior does not drift across code paths.</w:t>
+        <w:t xml:space="preserve">. </w:t>
+      </w:r>
+      <w:r>
+        <w:rPr>
+          <w:u w:val="thick"/>
+        </w:rPr>
+        <w:t>After</w:t>
+      </w:r>
+      <w:r>
+        <w:t xml:space="preserve"> </w:t>
+      </w:r>
+      <w:r>
+        <w:rPr>
+          <w:b/>
+          <w:bCs/>
+        </w:rPr>
+        <w:t>validating</w:t>
+      </w:r>
+      <w:r>
+        <w:t xml:space="preserve"> the </w:t>
+      </w:r>
+      <w:r>
+        <w:rPr>
+          <w:b/>
+          <w:bCs/>
+        </w:rPr>
+        <w:t>loader</w:t>
+      </w:r>
+      <w:r>
+        <w:t xml:space="preserve">, </w:t>
+      </w:r>
+      <w:r>
+        <w:rPr>
+          <w:b/>
+          <w:bCs/>
+        </w:rPr>
+        <w:t>consolidate</w:t>
+      </w:r>
+      <w:r>
+        <w:t xml:space="preserve"> </w:t>
+      </w:r>
+      <w:r>
+        <w:rPr>
+          <w:u w:val="thick"/>
+        </w:rPr>
+        <w:t>or</w:t>
+      </w:r>
+      <w:r>
+        <w:t xml:space="preserve"> </w:t>
+      </w:r>
+      <w:r>
+        <w:rPr>
+          <w:b/>
+          <w:bCs/>
+        </w:rPr>
+        <w:t>remove</w:t>
+      </w:r>
+      <w:r>
+        <w:t xml:space="preserve"> </w:t>
+      </w:r>
+      <w:r>
+        <w:t xml:space="preserve">- </w:t>
+      </w:r>
+      <w:r>
+        <w:rPr>
+          <w:b/>
+          <w:bCs/>
+        </w:rPr>
+        <w:t>duplicate</w:t>
+      </w:r>
+      <w:r>
+        <w:t xml:space="preserve"> </w:t>
+      </w:r>
+      <w:r>
+        <w:rPr>
+          <w:b/>
+          <w:bCs/>
+        </w:rPr>
+        <w:t>system-level instruction</w:t>
+      </w:r>
+      <w:r>
+        <w:t xml:space="preserve"> </w:t>
+      </w:r>
+      <w:r>
+        <w:rPr>
+          <w:b/>
+          <w:bCs/>
+        </w:rPr>
+        <w:t>strings</w:t>
+      </w:r>
+      <w:r>
+        <w:t xml:space="preserve"> </w:t>
+      </w:r>
+      <w:r>
+        <w:rPr>
+          <w:u w:val="thick"/>
+        </w:rPr>
+        <w:t>so</w:t>
+      </w:r>
+      <w:r>
+        <w:t xml:space="preserve"> </w:t>
+      </w:r>
+      <w:r>
+        <w:rPr>
+          <w:b/>
+          <w:bCs/>
+        </w:rPr>
+        <w:t>prompt behavior</w:t>
+      </w:r>
+      <w:r>
+        <w:t xml:space="preserve"> </w:t>
+      </w:r>
+      <w:r>
+        <w:t xml:space="preserve">- </w:t>
+      </w:r>
+      <w:r>
+        <w:rPr>
+          <w:b/>
+          <w:bCs/>
+        </w:rPr>
+        <w:t>does not drift across code paths</w:t>
+      </w:r>
+      <w:r>
+        <w:t>.</w:t>
       </w:r>
     </w:p>
     <w:p>
@@ -2476,6 +2790,27 @@
       <w:r>
         <w:rPr>
           <w:b/>
+          <w:color w:val="00B050"/>
+          <w:u w:val="thick"/>
+        </w:rPr>
+        <w:t>COMPLET</w:t>
+      </w:r>
+      <w:r>
+        <w:rPr>
+          <w:b/>
+          <w:color w:val="8064A2" w:themeColor="accent4"/>
+        </w:rPr>
+        <w:t xml:space="preserve"> </w:t>
+      </w:r>
+      <w:r>
+        <w:rPr>
+          <w:b/>
+        </w:rPr>
+        <w:t xml:space="preserve">- </w:t>
+      </w:r>
+      <w:r>
+        <w:rPr>
+          <w:b/>
         </w:rPr>
         <w:t>Do not remove dynamic authorization context</w:t>
       </w:r>
@@ -2490,6 +2825,27 @@
       <w:r>
         <w:rPr>
           <w:b/>
+          <w:color w:val="00B050"/>
+          <w:u w:val="thick"/>
+        </w:rPr>
+        <w:t>COMPLET</w:t>
+      </w:r>
+      <w:r>
+        <w:rPr>
+          <w:b/>
+          <w:color w:val="8064A2" w:themeColor="accent4"/>
+        </w:rPr>
+        <w:t xml:space="preserve"> </w:t>
+      </w:r>
+      <w:r>
+        <w:rPr>
+          <w:b/>
+        </w:rPr>
+        <w:t xml:space="preserve">- </w:t>
+      </w:r>
+      <w:r>
+        <w:rPr>
+          <w:b/>
         </w:rPr>
         <w:t>Add prompt version to telemetry</w:t>
       </w:r>
@@ -2504,8 +2860,53 @@
       <w:r>
         <w:rPr>
           <w:b/>
-        </w:rPr>
-        <w:t>Do not log the complete system prompt in normal telemetry</w:t>
+          <w:color w:val="00B050"/>
+          <w:u w:val="thick"/>
+        </w:rPr>
+        <w:t>COMPLET</w:t>
+      </w:r>
+      <w:r>
+        <w:rPr>
+          <w:b/>
+          <w:color w:val="8064A2" w:themeColor="accent4"/>
+        </w:rPr>
+        <w:t xml:space="preserve"> </w:t>
+      </w:r>
+      <w:r>
+        <w:rPr>
+          <w:b/>
+        </w:rPr>
+        <w:t xml:space="preserve">- </w:t>
+      </w:r>
+      <w:r>
+        <w:rPr>
+          <w:b/>
+        </w:rPr>
+        <w:t xml:space="preserve">Do not log </w:t>
+      </w:r>
+      <w:r>
+        <w:rPr>
+          <w:bCs/>
+        </w:rPr>
+        <w:t>the</w:t>
+      </w:r>
+      <w:r>
+        <w:rPr>
+          <w:b/>
+        </w:rPr>
+        <w:t xml:space="preserve"> complete system prompt </w:t>
+      </w:r>
+      <w:r>
+        <w:rPr>
+          <w:bCs/>
+        </w:rPr>
+        <w:t>in</w:t>
+      </w:r>
+      <w:r>
+        <w:rPr>
+          <w:b/>
+        </w:rPr>
+        <w:t xml:space="preserve"> normal telemetry</w:t>
       </w:r>
       <w:r>
         <w:t>. Record the version, filename/config identifier, and optionally a hash, but not the full prompt contents.</w:t>
@@ -2518,6 +2919,27 @@
       <w:r>
         <w:rPr>
           <w:b/>
+          <w:color w:val="00B050"/>
+          <w:u w:val="thick"/>
+        </w:rPr>
+        <w:t>COMPLET</w:t>
+      </w:r>
+      <w:r>
+        <w:rPr>
+          <w:b/>
+          <w:color w:val="8064A2" w:themeColor="accent4"/>
+        </w:rPr>
+        <w:t xml:space="preserve"> </w:t>
+      </w:r>
+      <w:r>
+        <w:rPr>
+          <w:b/>
+        </w:rPr>
+        <w:t xml:space="preserve">- </w:t>
+      </w:r>
+      <w:r>
+        <w:rPr>
+          <w:b/>
         </w:rPr>
         <w:t>Optionally calculate and log a prompt hash</w:t>
       </w:r>
@@ -2532,12 +2954,92 @@
       <w:r>
         <w:rPr>
           <w:b/>
+          <w:color w:val="00B050"/>
+          <w:u w:val="thick"/>
         </w:rPr>
         <w:lastRenderedPageBreak/>
+        <w:t>COMPLETE</w:t>
+      </w:r>
+      <w:r>
+        <w:rPr>
+          <w:b/>
+          <w:color w:val="00B050"/>
+        </w:rPr>
+        <w:t xml:space="preserve"> </w:t>
+      </w:r>
+      <w:r>
+        <w:rPr>
+          <w:b/>
+        </w:rPr>
+        <w:t xml:space="preserve">- </w:t>
+      </w:r>
+      <w:r>
+        <w:rPr>
+          <w:b/>
+        </w:rPr>
         <w:t>Support environment separation</w:t>
       </w:r>
       <w:r>
-        <w:t>. Local/dev/test/prod should be able to select the approved prompt version through configuration rather than code edits.</w:t>
+        <w:t xml:space="preserve">. </w:t>
+      </w:r>
+      <w:r>
+        <w:rPr>
+          <w:b/>
+          <w:bCs/>
+        </w:rPr>
+        <w:t>Local/dev/test/prod</w:t>
+      </w:r>
+      <w:r>
+        <w:t xml:space="preserve"> </w:t>
+      </w:r>
+      <w:r>
+        <w:rPr>
+          <w:u w:val="thick"/>
+        </w:rPr>
+        <w:t>should</w:t>
+      </w:r>
+      <w:r>
+        <w:t xml:space="preserve"> be able to </w:t>
+      </w:r>
+      <w:r>
+        <w:rPr>
+          <w:b/>
+          <w:bCs/>
+        </w:rPr>
+        <w:t>select</w:t>
+      </w:r>
+      <w:r>
+        <w:t xml:space="preserve"> the </w:t>
+      </w:r>
+      <w:r>
+        <w:rPr>
+          <w:b/>
+          <w:bCs/>
+        </w:rPr>
+        <w:t>approved prompt version</w:t>
+      </w:r>
+      <w:r>
+        <w:t xml:space="preserve"> through </w:t>
+      </w:r>
+      <w:r>
+        <w:rPr>
+          <w:b/>
+          <w:bCs/>
+        </w:rPr>
+        <w:t>configuration</w:t>
+      </w:r>
+      <w:r>
+        <w:t xml:space="preserve"> rather than </w:t>
+      </w:r>
+      <w:r>
+        <w:rPr>
+          <w:b/>
+          <w:bCs/>
+        </w:rPr>
+        <w:t>code edits</w:t>
+      </w:r>
+      <w:r>
+        <w:t>.</w:t>
       </w:r>
     </w:p>
     <w:p>
@@ -2547,6 +3049,27 @@
       <w:r>
         <w:rPr>
           <w:b/>
+          <w:color w:val="00B050"/>
+          <w:u w:val="thick"/>
+        </w:rPr>
+        <w:t>COMPLETE</w:t>
+      </w:r>
+      <w:r>
+        <w:rPr>
+          <w:b/>
+          <w:color w:val="00B050"/>
+        </w:rPr>
+        <w:t xml:space="preserve"> </w:t>
+      </w:r>
+      <w:r>
+        <w:rPr>
+          <w:b/>
+        </w:rPr>
+        <w:t xml:space="preserve">- </w:t>
+      </w:r>
+      <w:r>
+        <w:rPr>
+          <w:b/>
         </w:rPr>
         <w:t>Put prompt files under Git source control</w:t>
       </w:r>
@@ -2561,6 +3084,27 @@
       <w:r>
         <w:rPr>
           <w:b/>
+          <w:color w:val="00B050"/>
+          <w:u w:val="thick"/>
+        </w:rPr>
+        <w:t>COMPLETE</w:t>
+      </w:r>
+      <w:r>
+        <w:rPr>
+          <w:b/>
+          <w:color w:val="00B050"/>
+        </w:rPr>
+        <w:t xml:space="preserve"> </w:t>
+      </w:r>
+      <w:r>
+        <w:rPr>
+          <w:b/>
+        </w:rPr>
+        <w:t xml:space="preserve">- </w:t>
+      </w:r>
+      <w:r>
+        <w:rPr>
+          <w:b/>
         </w:rPr>
         <w:t>Do not overwrite v1 for significant changes</w:t>
       </w:r>
@@ -2575,11 +3119,290 @@
       <w:r>
         <w:rPr>
           <w:b/>
-        </w:rPr>
-        <w:t>Create a regression test set</w:t>
-      </w:r>
-      <w:r>
-        <w:t>. Include normal policy questions, valid Search evidence, no relevant evidence, unauthorized evidence, conflicting conversation history, conflicting summaries, citation behavior, and attempted prompt injection.</w:t>
+          <w:color w:val="00B050"/>
+          <w:u w:val="thick"/>
+        </w:rPr>
+        <w:t>COMPLETE</w:t>
+      </w:r>
+      <w:r>
+        <w:rPr>
+          <w:b/>
+          <w:color w:val="00B050"/>
+        </w:rPr>
+        <w:t xml:space="preserve"> </w:t>
+      </w:r>
+      <w:r>
+        <w:rPr>
+          <w:b/>
+        </w:rPr>
+        <w:t xml:space="preserve">- </w:t>
+      </w:r>
+      <w:r>
+        <w:rPr>
+          <w:b/>
+        </w:rPr>
+        <w:t xml:space="preserve">Create </w:t>
+      </w:r>
+      <w:r>
+        <w:rPr>
+          <w:bCs/>
+        </w:rPr>
+        <w:t>a</w:t>
+      </w:r>
+      <w:r>
+        <w:rPr>
+          <w:b/>
+        </w:rPr>
+        <w:t xml:space="preserve"> regression test set</w:t>
+      </w:r>
+      <w:r>
+        <w:t xml:space="preserve">. </w:t>
+      </w:r>
+      <w:r>
+        <w:rPr>
+          <w:u w:val="thick"/>
+        </w:rPr>
+        <w:t>Include</w:t>
+      </w:r>
+      <w:r>
+        <w:t xml:space="preserve"> </w:t>
+      </w:r>
+    </w:p>
+    <w:p>
+      <w:pPr>
+        <w:pStyle w:val="ListNumber"/>
+        <w:numPr>
+          <w:ilvl w:val="0"/>
+          <w:numId w:val="10"/>
+        </w:numPr>
+        <w:tabs>
+          <w:tab w:val="num" w:pos="720"/>
+        </w:tabs>
+      </w:pPr>
+      <w:r>
+        <w:rPr>
+          <w:b/>
+          <w:bCs/>
+        </w:rPr>
+        <w:t>N</w:t>
+      </w:r>
+      <w:r>
+        <w:rPr>
+          <w:b/>
+          <w:bCs/>
+        </w:rPr>
+        <w:t>ormal policy questions</w:t>
+      </w:r>
+      <w:r>
+        <w:t xml:space="preserve">, </w:t>
+      </w:r>
+    </w:p>
+    <w:p>
+      <w:pPr>
+        <w:pStyle w:val="ListNumber"/>
+        <w:numPr>
+          <w:ilvl w:val="0"/>
+          <w:numId w:val="10"/>
+        </w:numPr>
+        <w:tabs>
+          <w:tab w:val="num" w:pos="720"/>
+        </w:tabs>
+      </w:pPr>
+      <w:r>
+        <w:rPr>
+          <w:b/>
+          <w:bCs/>
+        </w:rPr>
+        <w:t>V</w:t>
+      </w:r>
+      <w:r>
+        <w:rPr>
+          <w:b/>
+          <w:bCs/>
+        </w:rPr>
+        <w:t>alid Search evidence</w:t>
+      </w:r>
+      <w:r>
+        <w:t xml:space="preserve">, </w:t>
+      </w:r>
+    </w:p>
+    <w:p>
+      <w:pPr>
+        <w:pStyle w:val="ListNumber"/>
+        <w:numPr>
+          <w:ilvl w:val="0"/>
+          <w:numId w:val="10"/>
+        </w:numPr>
+        <w:tabs>
+          <w:tab w:val="num" w:pos="720"/>
+        </w:tabs>
+      </w:pPr>
+      <w:r>
+        <w:t>N</w:t>
+      </w:r>
+      <w:r>
+        <w:t xml:space="preserve">o </w:t>
+      </w:r>
+      <w:r>
+        <w:rPr>
+          <w:b/>
+          <w:bCs/>
+        </w:rPr>
+        <w:t>relevant evidence</w:t>
+      </w:r>
+      <w:r>
+        <w:t xml:space="preserve">, </w:t>
+      </w:r>
+    </w:p>
+    <w:p>
+      <w:pPr>
+        <w:pStyle w:val="ListNumber"/>
+        <w:numPr>
+          <w:ilvl w:val="0"/>
+          <w:numId w:val="10"/>
+        </w:numPr>
+        <w:tabs>
+          <w:tab w:val="num" w:pos="720"/>
+        </w:tabs>
+      </w:pPr>
+      <w:r>
+        <w:rPr>
+          <w:b/>
+          <w:bCs/>
+        </w:rPr>
+        <w:t>U</w:t>
+      </w:r>
+      <w:r>
+        <w:rPr>
+          <w:b/>
+          <w:bCs/>
+        </w:rPr>
+        <w:t>nauthorized evidence</w:t>
+      </w:r>
+      <w:r>
+        <w:t xml:space="preserve">, </w:t>
+      </w:r>
+    </w:p>
+    <w:p>
+      <w:pPr>
+        <w:pStyle w:val="ListNumber"/>
+        <w:numPr>
+          <w:ilvl w:val="0"/>
+          <w:numId w:val="10"/>
+        </w:numPr>
+        <w:tabs>
+          <w:tab w:val="num" w:pos="720"/>
+        </w:tabs>
+      </w:pPr>
+      <w:r>
+        <w:rPr>
+          <w:b/>
+          <w:bCs/>
+        </w:rPr>
+        <w:t>C</w:t>
+      </w:r>
+      <w:r>
+        <w:rPr>
+          <w:b/>
+          <w:bCs/>
+        </w:rPr>
+        <w:t>onflicting conversation history</w:t>
+      </w:r>
+      <w:r>
+        <w:t xml:space="preserve">, </w:t>
+      </w:r>
+    </w:p>
+    <w:p>
+      <w:pPr>
+        <w:pStyle w:val="ListNumber"/>
+        <w:numPr>
+          <w:ilvl w:val="0"/>
+          <w:numId w:val="10"/>
+        </w:numPr>
+        <w:tabs>
+          <w:tab w:val="num" w:pos="720"/>
+        </w:tabs>
+      </w:pPr>
+      <w:r>
+        <w:rPr>
+          <w:b/>
+          <w:bCs/>
+        </w:rPr>
+        <w:t>C</w:t>
+      </w:r>
+      <w:r>
+        <w:rPr>
+          <w:b/>
+          <w:bCs/>
+        </w:rPr>
+        <w:t>onflicting summaries</w:t>
+      </w:r>
+      <w:r>
+        <w:t xml:space="preserve">, </w:t>
+      </w:r>
+    </w:p>
+    <w:p>
+      <w:pPr>
+        <w:pStyle w:val="ListNumber"/>
+        <w:numPr>
+          <w:ilvl w:val="0"/>
+          <w:numId w:val="10"/>
+        </w:numPr>
+        <w:tabs>
+          <w:tab w:val="num" w:pos="720"/>
+        </w:tabs>
+      </w:pPr>
+      <w:r>
+        <w:rPr>
+          <w:b/>
+          <w:bCs/>
+        </w:rPr>
+        <w:t>C</w:t>
+      </w:r>
+      <w:r>
+        <w:rPr>
+          <w:b/>
+          <w:bCs/>
+        </w:rPr>
+        <w:t>itation behavior</w:t>
+      </w:r>
+      <w:r>
+        <w:t xml:space="preserve">, </w:t>
+      </w:r>
+      <w:r>
+        <w:rPr>
+          <w:u w:val="thick"/>
+        </w:rPr>
+        <w:t>and</w:t>
+      </w:r>
+      <w:r>
+        <w:t xml:space="preserve"> </w:t>
+      </w:r>
+    </w:p>
+    <w:p>
+      <w:pPr>
+        <w:pStyle w:val="ListNumber"/>
+        <w:numPr>
+          <w:ilvl w:val="0"/>
+          <w:numId w:val="10"/>
+        </w:numPr>
+      </w:pPr>
+      <w:r>
+        <w:rPr>
+          <w:b/>
+          <w:bCs/>
+        </w:rPr>
+        <w:t>A</w:t>
+      </w:r>
+      <w:r>
+        <w:rPr>
+          <w:b/>
+          <w:bCs/>
+        </w:rPr>
+        <w:t>ttempted prompt injection</w:t>
+      </w:r>
+      <w:r>
+        <w:t>.</w:t>
       </w:r>
     </w:p>
     <w:p>
@@ -2589,6 +3412,27 @@
       <w:r>
         <w:rPr>
           <w:b/>
+          <w:color w:val="00B050"/>
+          <w:u w:val="thick"/>
+        </w:rPr>
+        <w:t>COMPLETE</w:t>
+      </w:r>
+      <w:r>
+        <w:rPr>
+          <w:b/>
+          <w:color w:val="00B050"/>
+        </w:rPr>
+        <w:t xml:space="preserve"> </w:t>
+      </w:r>
+      <w:r>
+        <w:rPr>
+          <w:b/>
+        </w:rPr>
+        <w:t xml:space="preserve">- </w:t>
+      </w:r>
+      <w:r>
+        <w:rPr>
+          <w:b/>
         </w:rPr>
         <w:t>Test normal grounding</w:t>
       </w:r>
@@ -2603,11 +3447,149 @@
       <w:r>
         <w:rPr>
           <w:b/>
+          <w:color w:val="00B050"/>
+        </w:rPr>
+        <w:t>PASS</w:t>
+      </w:r>
+      <w:r>
+        <w:rPr>
+          <w:b/>
+          <w:color w:val="00B050"/>
+        </w:rPr>
+        <w:t xml:space="preserve"> </w:t>
+      </w:r>
+      <w:r>
+        <w:rPr>
+          <w:b/>
+        </w:rPr>
+        <w:t xml:space="preserve">- </w:t>
+      </w:r>
+      <w:r>
+        <w:rPr>
+          <w:b/>
         </w:rPr>
         <w:t>Test missing evidence</w:t>
       </w:r>
       <w:r>
         <w:t>. Ask about a policy that does not exist in the test corpus. The model should not invent one.</w:t>
+      </w:r>
+    </w:p>
+    <w:p>
+      <w:pPr>
+        <w:pStyle w:val="ListNumber"/>
+        <w:rPr>
+          <w:b/>
+          <w:bCs/>
+        </w:rPr>
+      </w:pPr>
+      <w:r>
+        <w:rPr>
+          <w:b/>
+          <w:color w:val="00B050"/>
+        </w:rPr>
+        <w:t>PASS</w:t>
+      </w:r>
+      <w:r>
+        <w:rPr>
+          <w:b/>
+          <w:color w:val="8064A2" w:themeColor="accent4"/>
+        </w:rPr>
+        <w:t xml:space="preserve"> </w:t>
+      </w:r>
+      <w:r>
+        <w:rPr>
+          <w:b/>
+        </w:rPr>
+        <w:t xml:space="preserve">- </w:t>
+      </w:r>
+      <w:r>
+        <w:rPr>
+          <w:b/>
+        </w:rPr>
+        <w:t>Test authority precedence</w:t>
+      </w:r>
+      <w:r>
+        <w:t xml:space="preserve">. </w:t>
+      </w:r>
+      <w:r>
+        <w:rPr>
+          <w:u w:val="thick"/>
+        </w:rPr>
+        <w:t>Place</w:t>
+      </w:r>
+      <w:r>
+        <w:t xml:space="preserve"> an </w:t>
+      </w:r>
+      <w:r>
+        <w:rPr>
+          <w:b/>
+          <w:bCs/>
+        </w:rPr>
+        <w:t>incorrect statement</w:t>
+      </w:r>
+      <w:r>
+        <w:t xml:space="preserve"> </w:t>
+      </w:r>
+      <w:r>
+        <w:rPr>
+          <w:u w:val="thick"/>
+        </w:rPr>
+        <w:t>in</w:t>
+      </w:r>
+      <w:r>
+        <w:t xml:space="preserve"> </w:t>
+      </w:r>
+      <w:r>
+        <w:rPr>
+          <w:b/>
+          <w:bCs/>
+        </w:rPr>
+        <w:t>prior conversation history</w:t>
+      </w:r>
+      <w:r>
+        <w:t xml:space="preserve"> and </w:t>
+      </w:r>
+      <w:r>
+        <w:rPr>
+          <w:u w:val="thick"/>
+        </w:rPr>
+        <w:t>retrieve</w:t>
+      </w:r>
+      <w:r>
+        <w:rPr>
+          <w:b/>
+          <w:bCs/>
+        </w:rPr>
+        <w:t xml:space="preserve"> correct current policy evidence</w:t>
+      </w:r>
+      <w:r>
+        <w:t xml:space="preserve">. The </w:t>
+      </w:r>
+      <w:r>
+        <w:rPr>
+          <w:b/>
+          <w:bCs/>
+        </w:rPr>
+        <w:t>final answer</w:t>
+      </w:r>
+      <w:r>
+        <w:t xml:space="preserve"> </w:t>
+      </w:r>
+      <w:r>
+        <w:rPr>
+          <w:u w:val="thick"/>
+        </w:rPr>
+        <w:t>should follow</w:t>
+      </w:r>
+      <w:r>
+        <w:t xml:space="preserve"> the </w:t>
+      </w:r>
+      <w:r>
+        <w:rPr>
+          <w:b/>
+          <w:bCs/>
+        </w:rPr>
+        <w:t>current authorized evidence.</w:t>
       </w:r>
     </w:p>
     <w:p>
@@ -2617,11 +3599,214 @@
       <w:r>
         <w:rPr>
           <w:b/>
-        </w:rPr>
-        <w:t>Test authority precedence</w:t>
-      </w:r>
-      <w:r>
-        <w:t>. Place an incorrect statement in prior conversation history and retrieve correct current policy evidence. The final answer should follow the current authorized evidence.</w:t>
+          <w:color w:val="00B050"/>
+        </w:rPr>
+        <w:t>PASS</w:t>
+      </w:r>
+      <w:r>
+        <w:rPr>
+          <w:b/>
+          <w:color w:val="8064A2" w:themeColor="accent4"/>
+        </w:rPr>
+        <w:t xml:space="preserve"> </w:t>
+      </w:r>
+      <w:r>
+        <w:rPr>
+          <w:b/>
+        </w:rPr>
+        <w:t xml:space="preserve">- </w:t>
+      </w:r>
+      <w:r>
+        <w:rPr>
+          <w:b/>
+        </w:rPr>
+        <w:t xml:space="preserve">Test prompt injection </w:t>
+      </w:r>
+      <w:r>
+        <w:rPr>
+          <w:bCs/>
+          <w:u w:val="thick"/>
+        </w:rPr>
+        <w:t>through</w:t>
+      </w:r>
+      <w:r>
+        <w:rPr>
+          <w:b/>
+        </w:rPr>
+        <w:t xml:space="preserve"> user input</w:t>
+      </w:r>
+      <w:r>
+        <w:t xml:space="preserve">. </w:t>
+      </w:r>
+      <w:r>
+        <w:rPr>
+          <w:u w:val="thick"/>
+        </w:rPr>
+        <w:t>Verify</w:t>
+      </w:r>
+      <w:r>
+        <w:t xml:space="preserve"> that a </w:t>
+      </w:r>
+      <w:r>
+        <w:rPr>
+          <w:b/>
+          <w:bCs/>
+        </w:rPr>
+        <w:t xml:space="preserve">user instruction </w:t>
+      </w:r>
+      <w:r>
+        <w:rPr>
+          <w:u w:val="thick"/>
+        </w:rPr>
+        <w:t>to</w:t>
+      </w:r>
+      <w:r>
+        <w:rPr>
+          <w:b/>
+          <w:bCs/>
+        </w:rPr>
+        <w:t xml:space="preserve"> ignore policy/security rules</w:t>
+      </w:r>
+      <w:r>
+        <w:t xml:space="preserve"> </w:t>
+      </w:r>
+      <w:r>
+        <w:rPr>
+          <w:u w:val="thick"/>
+        </w:rPr>
+        <w:t>cannot</w:t>
+      </w:r>
+      <w:r>
+        <w:t xml:space="preserve"> </w:t>
+      </w:r>
+      <w:r>
+        <w:rPr>
+          <w:b/>
+          <w:bCs/>
+        </w:rPr>
+        <w:t>override</w:t>
+      </w:r>
+      <w:r>
+        <w:t xml:space="preserve"> the </w:t>
+      </w:r>
+      <w:r>
+        <w:rPr>
+          <w:b/>
+          <w:bCs/>
+        </w:rPr>
+        <w:t>system instructions</w:t>
+      </w:r>
+      <w:r>
+        <w:t>.</w:t>
+      </w:r>
+    </w:p>
+    <w:p>
+      <w:pPr>
+        <w:pStyle w:val="ListNumber"/>
+        <w:rPr>
+          <w:b/>
+          <w:bCs/>
+        </w:rPr>
+      </w:pPr>
+      <w:r>
+        <w:rPr>
+          <w:b/>
+          <w:color w:val="00B050"/>
+        </w:rPr>
+        <w:t>PASS</w:t>
+      </w:r>
+      <w:r>
+        <w:rPr>
+          <w:b/>
+          <w:color w:val="8064A2" w:themeColor="accent4"/>
+        </w:rPr>
+        <w:t xml:space="preserve"> </w:t>
+      </w:r>
+      <w:r>
+        <w:rPr>
+          <w:b/>
+        </w:rPr>
+        <w:t xml:space="preserve">- </w:t>
+      </w:r>
+      <w:r>
+        <w:rPr>
+          <w:b/>
+        </w:rPr>
+        <w:t>Test prompt injection through retrieved content</w:t>
+      </w:r>
+      <w:r>
+        <w:t xml:space="preserve">. </w:t>
+      </w:r>
+      <w:r>
+        <w:rPr>
+          <w:b/>
+          <w:bCs/>
+        </w:rPr>
+        <w:t>Text</w:t>
+      </w:r>
+      <w:r>
+        <w:t xml:space="preserve"> </w:t>
+      </w:r>
+      <w:r>
+        <w:rPr>
+          <w:u w:val="thick"/>
+        </w:rPr>
+        <w:t>inside</w:t>
+      </w:r>
+      <w:r>
+        <w:t xml:space="preserve"> </w:t>
+      </w:r>
+      <w:r>
+        <w:rPr>
+          <w:b/>
+          <w:bCs/>
+        </w:rPr>
+        <w:t>retrieved documents</w:t>
+      </w:r>
+      <w:r>
+        <w:t xml:space="preserve"> that </w:t>
+      </w:r>
+      <w:r>
+        <w:rPr>
+          <w:b/>
+          <w:bCs/>
+        </w:rPr>
+        <w:t>resembles model instructions</w:t>
+      </w:r>
+      <w:r>
+        <w:t xml:space="preserve"> </w:t>
+      </w:r>
+      <w:r>
+        <w:rPr>
+          <w:u w:val="thick"/>
+        </w:rPr>
+        <w:t>must remain</w:t>
+      </w:r>
+      <w:r>
+        <w:t xml:space="preserve"> </w:t>
+      </w:r>
+      <w:r>
+        <w:rPr>
+          <w:b/>
+          <w:bCs/>
+        </w:rPr>
+        <w:t>evidence/data</w:t>
+      </w:r>
+      <w:r>
+        <w:t xml:space="preserve"> and </w:t>
+      </w:r>
+      <w:r>
+        <w:rPr>
+          <w:u w:val="thick"/>
+        </w:rPr>
+        <w:t>must not become</w:t>
+      </w:r>
+      <w:r>
+        <w:rPr>
+          <w:b/>
+          <w:bCs/>
+        </w:rPr>
+        <w:t xml:space="preserve"> higher-priority instructions.</w:t>
       </w:r>
     </w:p>
     <w:p>
@@ -2631,11 +3816,95 @@
       <w:r>
         <w:rPr>
           <w:b/>
-        </w:rPr>
-        <w:t>Test prompt injection through user input</w:t>
-      </w:r>
-      <w:r>
-        <w:t>. Verify that a user instruction to ignore policy/security rules cannot override the system instructions.</w:t>
+          <w:color w:val="00B050"/>
+        </w:rPr>
+        <w:t>PASS</w:t>
+      </w:r>
+      <w:r>
+        <w:rPr>
+          <w:b/>
+          <w:color w:val="8064A2" w:themeColor="accent4"/>
+        </w:rPr>
+        <w:t xml:space="preserve"> </w:t>
+      </w:r>
+      <w:r>
+        <w:rPr>
+          <w:b/>
+        </w:rPr>
+        <w:t xml:space="preserve">- </w:t>
+      </w:r>
+      <w:r>
+        <w:rPr>
+          <w:b/>
+        </w:rPr>
+        <w:t>Test authorization behavior</w:t>
+      </w:r>
+      <w:r>
+        <w:t xml:space="preserve">. </w:t>
+      </w:r>
+      <w:r>
+        <w:rPr>
+          <w:u w:val="thick"/>
+        </w:rPr>
+        <w:t>Confirm</w:t>
+      </w:r>
+      <w:r>
+        <w:t xml:space="preserve"> that </w:t>
+      </w:r>
+      <w:r>
+        <w:rPr>
+          <w:b/>
+          <w:bCs/>
+        </w:rPr>
+        <w:t>prompt wording</w:t>
+      </w:r>
+      <w:r>
+        <w:t xml:space="preserve"> </w:t>
+      </w:r>
+      <w:r>
+        <w:rPr>
+          <w:u w:val="thick"/>
+        </w:rPr>
+        <w:t>cannot cause</w:t>
+      </w:r>
+      <w:r>
+        <w:rPr>
+          <w:b/>
+          <w:bCs/>
+        </w:rPr>
+        <w:t xml:space="preserve"> </w:t>
+      </w:r>
+      <w:r>
+        <w:t>the</w:t>
+      </w:r>
+      <w:r>
+        <w:rPr>
+          <w:b/>
+          <w:bCs/>
+        </w:rPr>
+        <w:t xml:space="preserve"> model </w:t>
+      </w:r>
+      <w:r>
+        <w:t xml:space="preserve">to </w:t>
+      </w:r>
+      <w:r>
+        <w:rPr>
+          <w:u w:val="thick"/>
+        </w:rPr>
+        <w:t>reveal</w:t>
+      </w:r>
+      <w:r>
+        <w:t xml:space="preserve"> </w:t>
+      </w:r>
+      <w:r>
+        <w:rPr>
+          <w:b/>
+          <w:bCs/>
+        </w:rPr>
+        <w:t>policy content</w:t>
+      </w:r>
+      <w:r>
+        <w:t xml:space="preserve"> that I-09 filtered out.</w:t>
       </w:r>
     </w:p>
     <w:p>
@@ -2645,11 +3914,108 @@
       <w:r>
         <w:rPr>
           <w:b/>
-        </w:rPr>
-        <w:t>Test prompt injection through retrieved content</w:t>
-      </w:r>
-      <w:r>
-        <w:t>. Text inside retrieved documents that resembles model instructions must remain evidence/data and must not become higher-priority instructions.</w:t>
+          <w:color w:val="00B050"/>
+        </w:rPr>
+        <w:t>PASS</w:t>
+      </w:r>
+      <w:r>
+        <w:rPr>
+          <w:b/>
+          <w:color w:val="8064A2" w:themeColor="accent4"/>
+        </w:rPr>
+        <w:t xml:space="preserve"> </w:t>
+      </w:r>
+      <w:r>
+        <w:rPr>
+          <w:b/>
+        </w:rPr>
+        <w:t xml:space="preserve">- </w:t>
+      </w:r>
+      <w:r>
+        <w:rPr>
+          <w:b/>
+        </w:rPr>
+        <w:t>Test citations</w:t>
+      </w:r>
+      <w:r>
+        <w:t xml:space="preserve">. </w:t>
+      </w:r>
+      <w:r>
+        <w:rPr>
+          <w:u w:val="thick"/>
+        </w:rPr>
+        <w:t>Confirm</w:t>
+      </w:r>
+      <w:r>
+        <w:t xml:space="preserve"> the </w:t>
+      </w:r>
+      <w:r>
+        <w:rPr>
+          <w:b/>
+          <w:bCs/>
+        </w:rPr>
+        <w:t>system prompt</w:t>
+      </w:r>
+      <w:r>
+        <w:t xml:space="preserve"> </w:t>
+      </w:r>
+      <w:r>
+        <w:rPr>
+          <w:u w:val="thick"/>
+        </w:rPr>
+        <w:t>does not</w:t>
+      </w:r>
+      <w:r>
+        <w:t xml:space="preserve"> </w:t>
+      </w:r>
+      <w:r>
+        <w:rPr>
+          <w:b/>
+          <w:bCs/>
+        </w:rPr>
+        <w:t>interfere</w:t>
+      </w:r>
+      <w:r>
+        <w:t xml:space="preserve"> with </w:t>
+      </w:r>
+      <w:r>
+        <w:rPr>
+          <w:b/>
+          <w:bCs/>
+        </w:rPr>
+        <w:t>citation/source</w:t>
+      </w:r>
+      <w:r>
+        <w:t xml:space="preserve"> </w:t>
+      </w:r>
+      <w:r>
+        <w:rPr>
+          <w:b/>
+          <w:bCs/>
+        </w:rPr>
+        <w:t>structures</w:t>
+      </w:r>
+      <w:r>
+        <w:t xml:space="preserve"> </w:t>
+      </w:r>
+      <w:r>
+        <w:rPr>
+          <w:u w:val="thick"/>
+        </w:rPr>
+        <w:t>already</w:t>
+      </w:r>
+      <w:r>
+        <w:t xml:space="preserve"> </w:t>
+      </w:r>
+      <w:r>
+        <w:rPr>
+          <w:b/>
+          <w:bCs/>
+        </w:rPr>
+        <w:t>implemented</w:t>
+      </w:r>
+      <w:r>
+        <w:t xml:space="preserve"> under I-13.</w:t>
       </w:r>
     </w:p>
     <w:p>
@@ -2659,11 +4025,98 @@
       <w:r>
         <w:rPr>
           <w:b/>
-        </w:rPr>
-        <w:t>Test authorization behavior</w:t>
-      </w:r>
-      <w:r>
-        <w:t>. Confirm that prompt wording cannot cause the model to reveal policy content that I-09 filtered out.</w:t>
+          <w:color w:val="00B050"/>
+        </w:rPr>
+        <w:t>PASS</w:t>
+      </w:r>
+      <w:r>
+        <w:rPr>
+          <w:b/>
+          <w:color w:val="8064A2" w:themeColor="accent4"/>
+        </w:rPr>
+        <w:t xml:space="preserve"> </w:t>
+      </w:r>
+      <w:r>
+        <w:rPr>
+          <w:b/>
+        </w:rPr>
+        <w:t xml:space="preserve">- </w:t>
+      </w:r>
+      <w:r>
+        <w:rPr>
+          <w:b/>
+        </w:rPr>
+        <w:t>Test conversation summarization compatibility with I-27</w:t>
+      </w:r>
+      <w:r>
+        <w:t xml:space="preserve">. </w:t>
+      </w:r>
+      <w:r>
+        <w:rPr>
+          <w:u w:val="thick"/>
+        </w:rPr>
+        <w:t>Verify</w:t>
+      </w:r>
+      <w:r>
+        <w:t xml:space="preserve"> a </w:t>
+      </w:r>
+      <w:r>
+        <w:rPr>
+          <w:b/>
+          <w:bCs/>
+        </w:rPr>
+        <w:t>conversation summary</w:t>
+      </w:r>
+      <w:r>
+        <w:t xml:space="preserve"> </w:t>
+      </w:r>
+      <w:r>
+        <w:rPr>
+          <w:u w:val="thick"/>
+        </w:rPr>
+        <w:t>cannot</w:t>
+      </w:r>
+      <w:r>
+        <w:t xml:space="preserve"> </w:t>
+      </w:r>
+      <w:r>
+        <w:rPr>
+          <w:b/>
+          <w:bCs/>
+        </w:rPr>
+        <w:t>override</w:t>
+      </w:r>
+      <w:r>
+        <w:t xml:space="preserve"> the </w:t>
+      </w:r>
+      <w:r>
+        <w:rPr>
+          <w:b/>
+          <w:bCs/>
+        </w:rPr>
+        <w:t>base system prompt</w:t>
+      </w:r>
+      <w:r>
+        <w:t xml:space="preserve"> </w:t>
+      </w:r>
+      <w:r>
+        <w:rPr>
+          <w:u w:val="thick"/>
+        </w:rPr>
+        <w:t>or</w:t>
+      </w:r>
+      <w:r>
+        <w:t xml:space="preserve"> </w:t>
+      </w:r>
+      <w:r>
+        <w:rPr>
+          <w:b/>
+          <w:bCs/>
+        </w:rPr>
+        <w:t>current authorized Search evidence</w:t>
+      </w:r>
+      <w:r>
+        <w:t>.</w:t>
       </w:r>
     </w:p>
     <w:p>
@@ -2673,11 +4126,82 @@
       <w:r>
         <w:rPr>
           <w:b/>
-        </w:rPr>
-        <w:t>Test citations</w:t>
-      </w:r>
-      <w:r>
-        <w:t>. Confirm the system prompt does not interfere with citation/source structures already implemented under I-13.</w:t>
+          <w:color w:val="00B050"/>
+        </w:rPr>
+        <w:t>PASS</w:t>
+      </w:r>
+      <w:r>
+        <w:rPr>
+          <w:b/>
+          <w:color w:val="8064A2" w:themeColor="accent4"/>
+        </w:rPr>
+        <w:t xml:space="preserve"> </w:t>
+      </w:r>
+      <w:r>
+        <w:rPr>
+          <w:b/>
+        </w:rPr>
+        <w:t xml:space="preserve">- </w:t>
+      </w:r>
+      <w:r>
+        <w:rPr>
+          <w:b/>
+        </w:rPr>
+        <w:t>Verify startup logs</w:t>
+      </w:r>
+      <w:r>
+        <w:t xml:space="preserve">. </w:t>
+      </w:r>
+      <w:r>
+        <w:rPr>
+          <w:u w:val="thick"/>
+        </w:rPr>
+        <w:t>Confirm</w:t>
+      </w:r>
+      <w:r>
+        <w:t xml:space="preserve"> the </w:t>
+      </w:r>
+      <w:r>
+        <w:rPr>
+          <w:b/>
+          <w:bCs/>
+        </w:rPr>
+        <w:t>selected prompt version/configuration</w:t>
+      </w:r>
+      <w:r>
+        <w:t xml:space="preserve"> </w:t>
+      </w:r>
+      <w:r>
+        <w:t xml:space="preserve">- </w:t>
+      </w:r>
+      <w:r>
+        <w:rPr>
+          <w:b/>
+          <w:bCs/>
+        </w:rPr>
+        <w:t>loads successfully</w:t>
+      </w:r>
+      <w:r>
+        <w:t xml:space="preserve"> </w:t>
+      </w:r>
+      <w:r>
+        <w:rPr>
+          <w:u w:val="thick"/>
+        </w:rPr>
+        <w:t>without</w:t>
+      </w:r>
+      <w:r>
+        <w:t xml:space="preserve"> </w:t>
+      </w:r>
+      <w:r>
+        <w:rPr>
+          <w:b/>
+          <w:bCs/>
+        </w:rPr>
+        <w:t>exposing sensitive prompt text</w:t>
+      </w:r>
+      <w:r>
+        <w:t>.</w:t>
       </w:r>
     </w:p>
     <w:p>
@@ -2687,11 +4211,83 @@
       <w:r>
         <w:rPr>
           <w:b/>
-        </w:rPr>
-        <w:t>Test conversation summarization compatibility with I-27</w:t>
-      </w:r>
-      <w:r>
-        <w:t>. Verify a conversation summary cannot override the base system prompt or current authorized Search evidence.</w:t>
+          <w:color w:val="00B050"/>
+        </w:rPr>
+        <w:t>PASS</w:t>
+      </w:r>
+      <w:r>
+        <w:rPr>
+          <w:b/>
+          <w:color w:val="8064A2" w:themeColor="accent4"/>
+        </w:rPr>
+        <w:t xml:space="preserve"> </w:t>
+      </w:r>
+      <w:r>
+        <w:rPr>
+          <w:b/>
+        </w:rPr>
+        <w:t xml:space="preserve">- </w:t>
+      </w:r>
+      <w:r>
+        <w:rPr>
+          <w:b/>
+        </w:rPr>
+        <w:t>Verify request telemetry</w:t>
+      </w:r>
+      <w:r>
+        <w:t xml:space="preserve">. Each </w:t>
+      </w:r>
+      <w:r>
+        <w:rPr>
+          <w:b/>
+          <w:bCs/>
+        </w:rPr>
+        <w:t>model request</w:t>
+      </w:r>
+      <w:r>
+        <w:t xml:space="preserve"> </w:t>
+      </w:r>
+      <w:r>
+        <w:rPr>
+          <w:u w:val="thick"/>
+        </w:rPr>
+        <w:t>should</w:t>
+      </w:r>
+      <w:r>
+        <w:t xml:space="preserve"> </w:t>
+      </w:r>
+      <w:r>
+        <w:rPr>
+          <w:b/>
+          <w:bCs/>
+        </w:rPr>
+        <w:t>identify</w:t>
+      </w:r>
+      <w:r>
+        <w:t xml:space="preserve"> the </w:t>
+      </w:r>
+      <w:r>
+        <w:rPr>
+          <w:b/>
+          <w:bCs/>
+        </w:rPr>
+        <w:t>system-prompt version</w:t>
+      </w:r>
+      <w:r>
+        <w:t xml:space="preserve"> </w:t>
+      </w:r>
+      <w:r>
+        <w:t xml:space="preserve">- </w:t>
+      </w:r>
+      <w:r>
+        <w:rPr>
+          <w:b/>
+          <w:bCs/>
+        </w:rPr>
+        <w:t>in use</w:t>
+      </w:r>
+      <w:r>
+        <w:t>.</w:t>
       </w:r>
     </w:p>
     <w:p>
@@ -2701,11 +4297,89 @@
       <w:r>
         <w:rPr>
           <w:b/>
-        </w:rPr>
-        <w:t>Verify startup logs</w:t>
-      </w:r>
-      <w:r>
-        <w:t>. Confirm the selected prompt version/configuration loads successfully without exposing sensitive prompt text.</w:t>
+          <w:color w:val="00B050"/>
+        </w:rPr>
+        <w:t>PASS</w:t>
+      </w:r>
+      <w:r>
+        <w:rPr>
+          <w:b/>
+          <w:color w:val="8064A2" w:themeColor="accent4"/>
+        </w:rPr>
+        <w:t xml:space="preserve"> </w:t>
+      </w:r>
+      <w:r>
+        <w:rPr>
+          <w:b/>
+        </w:rPr>
+        <w:t xml:space="preserve">- </w:t>
+      </w:r>
+      <w:r>
+        <w:rPr>
+          <w:b/>
+        </w:rPr>
+        <w:t>Verify configuration-driven prompt changes</w:t>
+      </w:r>
+      <w:r>
+        <w:t xml:space="preserve">. </w:t>
+      </w:r>
+      <w:r>
+        <w:rPr>
+          <w:u w:val="thick"/>
+        </w:rPr>
+        <w:t>Confirm</w:t>
+      </w:r>
+      <w:r>
+        <w:t xml:space="preserve"> that </w:t>
+      </w:r>
+      <w:r>
+        <w:rPr>
+          <w:b/>
+          <w:bCs/>
+        </w:rPr>
+        <w:t>changing only</w:t>
+      </w:r>
+      <w:r>
+        <w:t xml:space="preserve"> the </w:t>
+      </w:r>
+      <w:r>
+        <w:rPr>
+          <w:b/>
+          <w:bCs/>
+        </w:rPr>
+        <w:t>configured prompt version changes</w:t>
+      </w:r>
+      <w:r>
+        <w:t xml:space="preserve"> the </w:t>
+      </w:r>
+      <w:r>
+        <w:rPr>
+          <w:b/>
+          <w:bCs/>
+        </w:rPr>
+        <w:t>loaded instructions</w:t>
+      </w:r>
+      <w:r>
+        <w:t xml:space="preserve"> </w:t>
+      </w:r>
+      <w:r>
+        <w:rPr>
+          <w:u w:val="thick"/>
+        </w:rPr>
+        <w:t>without</w:t>
+      </w:r>
+      <w:r>
+        <w:t xml:space="preserve"> </w:t>
+      </w:r>
+      <w:r>
+        <w:rPr>
+          <w:b/>
+          <w:bCs/>
+        </w:rPr>
+        <w:t>requiring orchestration-code changes</w:t>
+      </w:r>
+      <w:r>
+        <w:t>.</w:t>
       </w:r>
     </w:p>
     <w:p>
@@ -2715,11 +4389,83 @@
       <w:r>
         <w:rPr>
           <w:b/>
-        </w:rPr>
-        <w:t>Verify request telemetry</w:t>
-      </w:r>
-      <w:r>
-        <w:t>. Each model request should identify the system-prompt version in use.</w:t>
+          <w:color w:val="00B050"/>
+        </w:rPr>
+        <w:t>PASS</w:t>
+      </w:r>
+      <w:r>
+        <w:rPr>
+          <w:b/>
+          <w:color w:val="8064A2" w:themeColor="accent4"/>
+        </w:rPr>
+        <w:t xml:space="preserve"> </w:t>
+      </w:r>
+      <w:r>
+        <w:rPr>
+          <w:b/>
+        </w:rPr>
+        <w:t xml:space="preserve">- </w:t>
+      </w:r>
+      <w:r>
+        <w:rPr>
+          <w:b/>
+        </w:rPr>
+        <w:t xml:space="preserve">Document </w:t>
+      </w:r>
+      <w:r>
+        <w:rPr>
+          <w:bCs/>
+        </w:rPr>
+        <w:t>the</w:t>
+      </w:r>
+      <w:r>
+        <w:rPr>
+          <w:b/>
+        </w:rPr>
+        <w:t xml:space="preserve"> initial approved prompt version</w:t>
+      </w:r>
+      <w:r>
+        <w:t xml:space="preserve">. </w:t>
+      </w:r>
+      <w:r>
+        <w:rPr>
+          <w:b/>
+          <w:bCs/>
+        </w:rPr>
+        <w:t>Record</w:t>
+      </w:r>
+      <w:r>
+        <w:t xml:space="preserve"> at </w:t>
+      </w:r>
+      <w:r>
+        <w:rPr>
+          <w:b/>
+          <w:bCs/>
+        </w:rPr>
+        <w:t>minimum</w:t>
+      </w:r>
+      <w:r>
+        <w:t xml:space="preserve">: Prompt version: 1.0; </w:t>
+      </w:r>
+      <w:r>
+        <w:rPr>
+          <w:b/>
+          <w:bCs/>
+        </w:rPr>
+        <w:t>Environment</w:t>
+      </w:r>
+      <w:r>
+        <w:t xml:space="preserve">: Development; </w:t>
+      </w:r>
+      <w:r>
+        <w:rPr>
+          <w:b/>
+          <w:bCs/>
+        </w:rPr>
+        <w:t>Status</w:t>
+      </w:r>
+      <w:r>
+        <w:t>: Approved for I-31 testing.</w:t>
       </w:r>
     </w:p>
     <w:p>
@@ -2729,11 +4475,79 @@
       <w:r>
         <w:rPr>
           <w:b/>
-        </w:rPr>
-        <w:t>Verify configuration-driven prompt changes</w:t>
-      </w:r>
-      <w:r>
-        <w:t>. Confirm that changing only the configured prompt version changes the loaded instructions without requiring orchestration-code changes.</w:t>
+          <w:color w:val="00B050"/>
+        </w:rPr>
+        <w:t>PASS</w:t>
+      </w:r>
+      <w:r>
+        <w:rPr>
+          <w:b/>
+          <w:color w:val="8064A2" w:themeColor="accent4"/>
+        </w:rPr>
+        <w:t xml:space="preserve"> </w:t>
+      </w:r>
+      <w:r>
+        <w:rPr>
+          <w:b/>
+        </w:rPr>
+        <w:t xml:space="preserve">- </w:t>
+      </w:r>
+      <w:r>
+        <w:rPr>
+          <w:b/>
+        </w:rPr>
+        <w:t>Run the complete I-31 regression suite</w:t>
+      </w:r>
+      <w:r>
+        <w:t xml:space="preserve">. </w:t>
+      </w:r>
+      <w:r>
+        <w:rPr>
+          <w:u w:val="thick"/>
+        </w:rPr>
+        <w:t>Capture</w:t>
+      </w:r>
+      <w:r>
+        <w:t xml:space="preserve"> </w:t>
+      </w:r>
+      <w:r>
+        <w:rPr>
+          <w:b/>
+          <w:bCs/>
+        </w:rPr>
+        <w:t>pass/fail results</w:t>
+      </w:r>
+      <w:r>
+        <w:t xml:space="preserve"> </w:t>
+      </w:r>
+      <w:r>
+        <w:rPr>
+          <w:u w:val="thick"/>
+        </w:rPr>
+        <w:t>before</w:t>
+      </w:r>
+      <w:r>
+        <w:t xml:space="preserve"> </w:t>
+      </w:r>
+      <w:r>
+        <w:rPr>
+          <w:b/>
+          <w:bCs/>
+        </w:rPr>
+        <w:t>declaring</w:t>
+      </w:r>
+      <w:r>
+        <w:t xml:space="preserve"> the </w:t>
+      </w:r>
+      <w:r>
+        <w:rPr>
+          <w:b/>
+          <w:bCs/>
+        </w:rPr>
+        <w:t>implementation complete</w:t>
+      </w:r>
+      <w:r>
+        <w:t>.</w:t>
       </w:r>
     </w:p>
     <w:p>
@@ -2743,11 +4557,31 @@
       <w:r>
         <w:rPr>
           <w:b/>
-        </w:rPr>
-        <w:t>Document the initial approved prompt version</w:t>
-      </w:r>
-      <w:r>
-        <w:t>. Record at minimum: Prompt version: 1.0; Environment: Development; Status: Approved for I-31 testing.</w:t>
+          <w:color w:val="00B050"/>
+        </w:rPr>
+        <w:t>PASS</w:t>
+      </w:r>
+      <w:r>
+        <w:rPr>
+          <w:b/>
+          <w:color w:val="8064A2" w:themeColor="accent4"/>
+        </w:rPr>
+        <w:t xml:space="preserve"> </w:t>
+      </w:r>
+      <w:r>
+        <w:rPr>
+          <w:b/>
+        </w:rPr>
+        <w:t xml:space="preserve">- </w:t>
+      </w:r>
+      <w:r>
+        <w:rPr>
+          <w:b/>
+        </w:rPr>
+        <w:t>Apply I-31 completion criteria</w:t>
+      </w:r>
+      <w:r>
+        <w:t>. Mark I-31 complete only when system instructions are centralized, externally stored, versioned, identified in telemetry, and regression/security tests pass.</w:t>
       </w:r>
     </w:p>
     <w:p>
@@ -2757,31 +4591,23 @@
       <w:r>
         <w:rPr>
           <w:b/>
-        </w:rPr>
-        <w:t>Run the complete I-31 regression suite</w:t>
-      </w:r>
-      <w:r>
-        <w:t>. Capture pass/fail results before declaring the implementation complete.</w:t>
-      </w:r>
-    </w:p>
-    <w:p>
-      <w:pPr>
-        <w:pStyle w:val="ListNumber"/>
-      </w:pPr>
-      <w:r>
-        <w:rPr>
-          <w:b/>
-        </w:rPr>
-        <w:t>Apply I-31 completion criteria</w:t>
-      </w:r>
-      <w:r>
-        <w:t>. Mark I-31 complete only when system instructions are centralized, externally stored, versioned, identified in telemetry, and regression/security tests pass.</w:t>
-      </w:r>
-    </w:p>
-    <w:p>
-      <w:pPr>
-        <w:pStyle w:val="ListNumber"/>
-      </w:pPr>
+          <w:color w:val="00B050"/>
+        </w:rPr>
+        <w:t>PASS</w:t>
+      </w:r>
+      <w:r>
+        <w:rPr>
+          <w:b/>
+          <w:color w:val="8064A2" w:themeColor="accent4"/>
+        </w:rPr>
+        <w:t xml:space="preserve"> </w:t>
+      </w:r>
+      <w:r>
+        <w:rPr>
+          <w:b/>
+        </w:rPr>
+        <w:t xml:space="preserve">- </w:t>
+      </w:r>
       <w:r>
         <w:rPr>
           <w:b/>
@@ -2797,6 +4623,7 @@
         <w:pStyle w:val="Heading1"/>
       </w:pPr>
       <w:r>
+        <w:lastRenderedPageBreak/>
         <w:t>Target Architecture Flow</w:t>
       </w:r>
     </w:p>
@@ -2878,13 +4705,6 @@
                 <w:sz w:val="19"/>
               </w:rPr>
               <w:br/>
-            </w:r>
-            <w:r>
-              <w:rPr>
-                <w:rFonts w:ascii="Consolas" w:hAnsi="Consolas"/>
-                <w:sz w:val="19"/>
-              </w:rPr>
-              <w:lastRenderedPageBreak/>
               <w:t>System Instructions</w:t>
             </w:r>
             <w:r>
@@ -2984,7 +4804,6 @@
         <w:pStyle w:val="Heading1"/>
       </w:pPr>
       <w:r>
-        <w:lastRenderedPageBreak/>
         <w:t>Recommended First Implementation Batch</w:t>
       </w:r>
     </w:p>
@@ -3294,7 +5113,7 @@
   <w:abstractNum w:abstractNumId="7" w15:restartNumberingAfterBreak="0">
     <w:nsid w:val="FFFFFF88"/>
     <w:multiLevelType w:val="singleLevel"/>
-    <w:tmpl w:val="D0A62B40"/>
+    <w:tmpl w:val="1DEC6CE4"/>
     <w:lvl w:ilvl="0">
       <w:start w:val="1"/>
       <w:numFmt w:val="decimal"/>
@@ -3307,6 +5126,10 @@
         </w:tabs>
         <w:ind w:left="360" w:hanging="360"/>
       </w:pPr>
+      <w:rPr>
+        <w:b w:val="0"/>
+        <w:bCs w:val="0"/>
+      </w:rPr>
     </w:lvl>
   </w:abstractNum>
   <w:abstractNum w:abstractNumId="8" w15:restartNumberingAfterBreak="0">
@@ -3327,6 +5150,119 @@
       </w:pPr>
       <w:rPr>
         <w:rFonts w:ascii="Symbol" w:hAnsi="Symbol" w:hint="default"/>
+      </w:rPr>
+    </w:lvl>
+  </w:abstractNum>
+  <w:abstractNum w:abstractNumId="9" w15:restartNumberingAfterBreak="0">
+    <w:nsid w:val="15A644C0"/>
+    <w:multiLevelType w:val="hybridMultilevel"/>
+    <w:tmpl w:val="B7EC8E72"/>
+    <w:lvl w:ilvl="0" w:tplc="04090001">
+      <w:start w:val="1"/>
+      <w:numFmt w:val="bullet"/>
+      <w:lvlText w:val=""/>
+      <w:lvlJc w:val="left"/>
+      <w:pPr>
+        <w:ind w:left="1080" w:hanging="360"/>
+      </w:pPr>
+      <w:rPr>
+        <w:rFonts w:ascii="Symbol" w:hAnsi="Symbol" w:hint="default"/>
+      </w:rPr>
+    </w:lvl>
+    <w:lvl w:ilvl="1" w:tplc="04090003" w:tentative="1">
+      <w:start w:val="1"/>
+      <w:numFmt w:val="bullet"/>
+      <w:lvlText w:val="o"/>
+      <w:lvlJc w:val="left"/>
+      <w:pPr>
+        <w:ind w:left="1800" w:hanging="360"/>
+      </w:pPr>
+      <w:rPr>
+        <w:rFonts w:ascii="Courier New" w:hAnsi="Courier New" w:cs="Courier New" w:hint="default"/>
+      </w:rPr>
+    </w:lvl>
+    <w:lvl w:ilvl="2" w:tplc="04090005" w:tentative="1">
+      <w:start w:val="1"/>
+      <w:numFmt w:val="bullet"/>
+      <w:lvlText w:val=""/>
+      <w:lvlJc w:val="left"/>
+      <w:pPr>
+        <w:ind w:left="2520" w:hanging="360"/>
+      </w:pPr>
+      <w:rPr>
+        <w:rFonts w:ascii="Wingdings" w:hAnsi="Wingdings" w:hint="default"/>
+      </w:rPr>
+    </w:lvl>
+    <w:lvl w:ilvl="3" w:tplc="04090001" w:tentative="1">
+      <w:start w:val="1"/>
+      <w:numFmt w:val="bullet"/>
+      <w:lvlText w:val=""/>
+      <w:lvlJc w:val="left"/>
+      <w:pPr>
+        <w:ind w:left="3240" w:hanging="360"/>
+      </w:pPr>
+      <w:rPr>
+        <w:rFonts w:ascii="Symbol" w:hAnsi="Symbol" w:hint="default"/>
+      </w:rPr>
+    </w:lvl>
+    <w:lvl w:ilvl="4" w:tplc="04090003" w:tentative="1">
+      <w:start w:val="1"/>
+      <w:numFmt w:val="bullet"/>
+      <w:lvlText w:val="o"/>
+      <w:lvlJc w:val="left"/>
+      <w:pPr>
+        <w:ind w:left="3960" w:hanging="360"/>
+      </w:pPr>
+      <w:rPr>
+        <w:rFonts w:ascii="Courier New" w:hAnsi="Courier New" w:cs="Courier New" w:hint="default"/>
+      </w:rPr>
+    </w:lvl>
+    <w:lvl w:ilvl="5" w:tplc="04090005" w:tentative="1">
+      <w:start w:val="1"/>
+      <w:numFmt w:val="bullet"/>
+      <w:lvlText w:val=""/>
+      <w:lvlJc w:val="left"/>
+      <w:pPr>
+        <w:ind w:left="4680" w:hanging="360"/>
+      </w:pPr>
+      <w:rPr>
+        <w:rFonts w:ascii="Wingdings" w:hAnsi="Wingdings" w:hint="default"/>
+      </w:rPr>
+    </w:lvl>
+    <w:lvl w:ilvl="6" w:tplc="04090001" w:tentative="1">
+      <w:start w:val="1"/>
+      <w:numFmt w:val="bullet"/>
+      <w:lvlText w:val=""/>
+      <w:lvlJc w:val="left"/>
+      <w:pPr>
+        <w:ind w:left="5400" w:hanging="360"/>
+      </w:pPr>
+      <w:rPr>
+        <w:rFonts w:ascii="Symbol" w:hAnsi="Symbol" w:hint="default"/>
+      </w:rPr>
+    </w:lvl>
+    <w:lvl w:ilvl="7" w:tplc="04090003" w:tentative="1">
+      <w:start w:val="1"/>
+      <w:numFmt w:val="bullet"/>
+      <w:lvlText w:val="o"/>
+      <w:lvlJc w:val="left"/>
+      <w:pPr>
+        <w:ind w:left="6120" w:hanging="360"/>
+      </w:pPr>
+      <w:rPr>
+        <w:rFonts w:ascii="Courier New" w:hAnsi="Courier New" w:cs="Courier New" w:hint="default"/>
+      </w:rPr>
+    </w:lvl>
+    <w:lvl w:ilvl="8" w:tplc="04090005" w:tentative="1">
+      <w:start w:val="1"/>
+      <w:numFmt w:val="bullet"/>
+      <w:lvlText w:val=""/>
+      <w:lvlJc w:val="left"/>
+      <w:pPr>
+        <w:ind w:left="6840" w:hanging="360"/>
+      </w:pPr>
+      <w:rPr>
+        <w:rFonts w:ascii="Wingdings" w:hAnsi="Wingdings" w:hint="default"/>
       </w:rPr>
     </w:lvl>
   </w:abstractNum>
@@ -3356,6 +5292,9 @@
   </w:num>
   <w:num w:numId="9" w16cid:durableId="559638922">
     <w:abstractNumId w:val="0"/>
+  </w:num>
+  <w:num w:numId="10" w16cid:durableId="770859768">
+    <w:abstractNumId w:val="9"/>
   </w:num>
 </w:numbering>
 </file>

</xml_diff>